<commit_message>
docs: QA workbooks test 1.5.0-beta (#49, #50, #51, #52, #132, #133) (1.5.1-beta)
Co-Authored-By: Claude Opus 5.5 <noreply@anthropic.com>
Claude-Session: https://claude.ai/code/session_017HvDcuheawf6ger4p9Vj6i
</commit_message>
<xml_diff>
--- a/qa/bambu-suite.docx
+++ b/qa/bambu-suite.docx
@@ -18,7 +18,7 @@
         <w:rPr>
           <w:b/>
         </w:rPr>
-        <w:t xml:space="preserve">SnugCut 1.4.0.1-beta</w:t>
+        <w:t xml:space="preserve">SnugCut 1.5.0-beta</w:t>
       </w:r>
       <w:r>
         <w:t xml:space="preserve">. Results go to </w:t>
@@ -376,7 +376,7 @@
           <w:rPr>
             <w:rStyle w:val="Hyperlink"/>
           </w:rPr>
-          <w:t xml:space="preserve">https://github.com/cyvaquero/snugcut/archive/refs/tags/1.4.0.1-beta.zip</w:t>
+          <w:t xml:space="preserve">https://github.com/cyvaquero/snugcut/archive/refs/tags/1.5.0-beta.zip</w:t>
         </w:r>
       </w:hyperlink>
       <w:r>
@@ -425,7 +425,7 @@
         <w:rPr>
           <w:b/>
         </w:rPr>
-        <w:t xml:space="preserve">The footer must show v1.4.0.1-beta.</w:t>
+        <w:t xml:space="preserve">The footer must show v1.5.0-beta.</w:t>
       </w:r>
     </w:p>
     <w:p>

</xml_diff>

<commit_message>
fix: accessibility, docs and CLAUDE.md trim from the 1.5.0-beta review (1.5.7-beta)
Toast Dismiss button that pauses while focused (#464, #455), settings rows
stack below 480 px (#463), plate grid no longer forces scroll below 300 px
(#455), noscript message (#454), tangled notice and README cover line ends
meeting at one point (#465), README limits bullet (#474), box-corner stock
note (#475), QA workbook test 14 step (#466), regression.py without
unescape() (#476), comment moved to removeParts (#477), README history issue
numbers removed and CLAUDE.md trimmed to under 120 lines (#486).

Co-Authored-By: Claude Opus 5.5 <noreply@anthropic.com>
Claude-Session: https://claude.ai/code/session_017HvDcuheawf6ger4p9Vj6i
</commit_message>
<xml_diff>
--- a/qa/bambu-suite.docx
+++ b/qa/bambu-suite.docx
@@ -5151,18 +5151,6 @@
       </w:pPr>
       <w:r>
         <w:t xml:space="preserve">Download the plate and import it. The download says kerf compensation is built in, and that a hole is narrower than the kerf and was left as drawn: that's the pin hole.</w:t>
-      </w:r>
-    </w:p>
-    <w:p>
-      <w:pPr>
-        <w:pStyle w:val="ListParagraph"/>
-        <w:numPr>
-          <w:ilvl w:val="0"/>
-          <w:numId w:val="17"/>
-        </w:numPr>
-      </w:pPr>
-      <w:r>
-        <w:t xml:space="preserve">Leave kerf and compensation as they are for test 22.</w:t>
       </w:r>
     </w:p>
     <w:p>

</xml_diff>

<commit_message>
docs: release prep for 1.6.0-beta: QA workbooks and documentation review fixes (1.5.12-beta)
- tools/qa_workbooks.py VERSION 1.6.0-beta, qa/*.docx regenerated.
- CHANGELOG 1.5.5-beta: the duplicated 45° arcs bullet removed.
- README: search comparison without version-tagged figures, Nesting mode location, Files table rows for
  .github/workflows/ and LICENSE, RELEASING.md description.
- CLAUDE.md: QA issues named by app, not number. RELEASING.md: fixtures/README.md path.
- fixtures/README.md names every fixture file. lib/snugcut.js comment: "canceling".

Refs #500

Co-Authored-By: Claude Opus 5.5 <noreply@anthropic.com>
Claude-Session: https://claude.ai/code/session_017HvDcuheawf6ger4p9Vj6i
</commit_message>
<xml_diff>
--- a/qa/bambu-suite.docx
+++ b/qa/bambu-suite.docx
@@ -18,7 +18,7 @@
         <w:rPr>
           <w:b/>
         </w:rPr>
-        <w:t xml:space="preserve">SnugCut 1.5.0-beta</w:t>
+        <w:t xml:space="preserve">SnugCut 1.6.0-beta</w:t>
       </w:r>
       <w:r>
         <w:t xml:space="preserve">. Results go to </w:t>
@@ -376,7 +376,7 @@
           <w:rPr>
             <w:rStyle w:val="Hyperlink"/>
           </w:rPr>
-          <w:t xml:space="preserve">https://github.com/cyvaquero/snugcut/archive/refs/tags/1.5.0-beta.zip</w:t>
+          <w:t xml:space="preserve">https://github.com/cyvaquero/snugcut/archive/refs/tags/1.6.0-beta.zip</w:t>
         </w:r>
       </w:hyperlink>
       <w:r>
@@ -425,7 +425,7 @@
         <w:rPr>
           <w:b/>
         </w:rPr>
-        <w:t xml:space="preserve">The footer must show v1.5.0-beta.</w:t>
+        <w:t xml:space="preserve">The footer must show v1.6.0-beta.</w:t>
       </w:r>
     </w:p>
     <w:p>

</xml_diff>

<commit_message>
docs: release prep for 1.7.0-beta: QA workbooks test 1.7.0-beta, documentation review fixes (1.6.10-beta)
Refs #520.

Co-Authored-By: Claude Opus 5.5 <noreply@anthropic.com>
Claude-Session: https://claude.ai/code/session_017HvDcuheawf6ger4p9Vj6i
</commit_message>
<xml_diff>
--- a/qa/bambu-suite.docx
+++ b/qa/bambu-suite.docx
@@ -18,7 +18,7 @@
         <w:rPr>
           <w:b/>
         </w:rPr>
-        <w:t xml:space="preserve">SnugCut 1.6.0-beta</w:t>
+        <w:t xml:space="preserve">SnugCut 1.7.0-beta</w:t>
       </w:r>
       <w:r>
         <w:t xml:space="preserve">. Results go to </w:t>
@@ -376,7 +376,7 @@
           <w:rPr>
             <w:rStyle w:val="Hyperlink"/>
           </w:rPr>
-          <w:t xml:space="preserve">https://github.com/cyvaquero/snugcut/archive/refs/tags/1.6.0-beta.zip</w:t>
+          <w:t xml:space="preserve">https://github.com/cyvaquero/snugcut/archive/refs/tags/1.7.0-beta.zip</w:t>
         </w:r>
       </w:hyperlink>
       <w:r>
@@ -425,7 +425,7 @@
         <w:rPr>
           <w:b/>
         </w:rPr>
-        <w:t xml:space="preserve">The footer must show v1.6.0-beta.</w:t>
+        <w:t xml:space="preserve">The footer must show v1.7.0-beta.</w:t>
       </w:r>
     </w:p>
     <w:p>
@@ -690,7 +690,7 @@
         </w:numPr>
       </w:pPr>
       <w:r>
-        <w:t xml:space="preserve">Tick </w:t>
+        <w:t xml:space="preserve">Check </w:t>
       </w:r>
       <w:r>
         <w:rPr>
@@ -732,7 +732,7 @@
         </w:numPr>
       </w:pPr>
       <w:r>
-        <w:t xml:space="preserve">Untick </w:t>
+        <w:t xml:space="preserve">Uncheck </w:t>
       </w:r>
       <w:r>
         <w:rPr>
@@ -2153,7 +2153,7 @@
         </w:numPr>
       </w:pPr>
       <w:r>
-        <w:t xml:space="preserve">Squares 1–8 are </w:t>
+        <w:t xml:space="preserve">Squares 1, 2, 4, 5, 6, 7 and 8 are </w:t>
       </w:r>
       <w:r>
         <w:rPr>
@@ -5108,7 +5108,7 @@
         <w:t xml:space="preserve">Kerf</w:t>
       </w:r>
       <w:r>
-        <w:t xml:space="preserve"> to 0.2 mm and tick </w:t>
+        <w:t xml:space="preserve"> to 0.2 mm and check </w:t>
       </w:r>
       <w:r>
         <w:rPr>
@@ -5447,7 +5447,7 @@
     </w:p>
     <w:p>
       <w:r>
-        <w:t xml:space="preserve">Set kerf back to 0.1 mm and untick </w:t>
+        <w:t xml:space="preserve">Set kerf back to 0.1 mm and uncheck </w:t>
       </w:r>
       <w:r>
         <w:rPr>
@@ -6793,7 +6793,7 @@
         </w:numPr>
       </w:pPr>
       <w:r>
-        <w:t xml:space="preserve">Tick </w:t>
+        <w:t xml:space="preserve">Check </w:t>
       </w:r>
       <w:r>
         <w:rPr>
@@ -6835,7 +6835,7 @@
         </w:numPr>
       </w:pPr>
       <w:r>
-        <w:t xml:space="preserve">Untick </w:t>
+        <w:t xml:space="preserve">Uncheck </w:t>
       </w:r>
       <w:r>
         <w:rPr>
@@ -7846,7 +7846,7 @@
         <w:t xml:space="preserve">Kerf</w:t>
       </w:r>
       <w:r>
-        <w:t xml:space="preserve"> to 0.2 mm and tick </w:t>
+        <w:t xml:space="preserve"> to 0.2 mm and check </w:t>
       </w:r>
       <w:r>
         <w:rPr>
@@ -7897,7 +7897,7 @@
         </w:numPr>
       </w:pPr>
       <w:r>
-        <w:t xml:space="preserve">Afterwards set kerf back to 0.1 mm, untick compensation and set </w:t>
+        <w:t xml:space="preserve">Afterwards set kerf back to 0.1 mm, uncheck compensation and set </w:t>
       </w:r>
       <w:r>
         <w:rPr>

</xml_diff>